<commit_message>
Week 16 group log
</commit_message>
<xml_diff>
--- a/Weekly Logs/-Group Timesheets/BHB - Week 16 hours.docx
+++ b/Weekly Logs/-Group Timesheets/BHB - Week 16 hours.docx
@@ -176,22 +176,25 @@
           </w:tcPr>
           <w:p>
             <w:r>
+              <w:t>3</w:t>
+            </w:r>
+            <w:r>
+              <w:t>h 30m</w:t>
+            </w:r>
+          </w:p>
+        </w:tc>
+        <w:tc>
+          <w:tcPr>
+            <w:tcW w:w="1101" w:type="dxa"/>
+          </w:tcPr>
+          <w:p>
+            <w:r>
               <w:t>2h 30m</w:t>
             </w:r>
           </w:p>
         </w:tc>
         <w:tc>
           <w:tcPr>
-            <w:tcW w:w="1101" w:type="dxa"/>
-          </w:tcPr>
-          <w:p>
-            <w:r>
-              <w:t>2h 30m</w:t>
-            </w:r>
-          </w:p>
-        </w:tc>
-        <w:tc>
-          <w:tcPr>
             <w:tcW w:w="1317" w:type="dxa"/>
           </w:tcPr>
           <w:p>
@@ -204,7 +207,11 @@
           <w:tcPr>
             <w:tcW w:w="2248" w:type="dxa"/>
           </w:tcPr>
-          <w:p/>
+          <w:p>
+            <w:r>
+              <w:t>10h 30m</w:t>
+            </w:r>
+          </w:p>
         </w:tc>
       </w:tr>
       <w:tr>
@@ -576,32 +583,32 @@
           </w:tcPr>
           <w:p>
             <w:r>
+              <w:t>8</w:t>
+            </w:r>
+          </w:p>
+        </w:tc>
+        <w:tc>
+          <w:tcPr>
+            <w:tcW w:w="1101" w:type="dxa"/>
+          </w:tcPr>
+          <w:p>
+            <w:r>
               <w:t>1</w:t>
             </w:r>
-          </w:p>
-        </w:tc>
-        <w:tc>
-          <w:tcPr>
-            <w:tcW w:w="1101" w:type="dxa"/>
+            <w:r>
+              <w:t>3h 30m</w:t>
+            </w:r>
+          </w:p>
+        </w:tc>
+        <w:tc>
+          <w:tcPr>
+            <w:tcW w:w="1317" w:type="dxa"/>
           </w:tcPr>
           <w:p>
             <w:r>
               <w:t>1</w:t>
             </w:r>
             <w:r>
-              <w:t>3h 30m</w:t>
-            </w:r>
-          </w:p>
-        </w:tc>
-        <w:tc>
-          <w:tcPr>
-            <w:tcW w:w="1317" w:type="dxa"/>
-          </w:tcPr>
-          <w:p>
-            <w:r>
-              <w:t>1</w:t>
-            </w:r>
-            <w:r>
               <w:t>4</w:t>
             </w:r>
           </w:p>
@@ -612,7 +619,7 @@
           </w:tcPr>
           <w:p>
             <w:r>
-              <w:t>4</w:t>
+              <w:t>50h 45m</w:t>
             </w:r>
           </w:p>
         </w:tc>
@@ -652,6 +659,22 @@
           <w:tcPr>
             <w:tcW w:w="1166" w:type="dxa"/>
           </w:tcPr>
+          <w:p/>
+        </w:tc>
+        <w:tc>
+          <w:tcPr>
+            <w:tcW w:w="1101" w:type="dxa"/>
+          </w:tcPr>
+          <w:p>
+            <w:r>
+              <w:t>11</w:t>
+            </w:r>
+          </w:p>
+        </w:tc>
+        <w:tc>
+          <w:tcPr>
+            <w:tcW w:w="1317" w:type="dxa"/>
+          </w:tcPr>
           <w:p>
             <w:r>
               <w:t>8</w:t>
@@ -660,29 +683,13 @@
         </w:tc>
         <w:tc>
           <w:tcPr>
-            <w:tcW w:w="1101" w:type="dxa"/>
-          </w:tcPr>
-          <w:p>
-            <w:r>
-              <w:t>11</w:t>
-            </w:r>
-          </w:p>
-        </w:tc>
-        <w:tc>
-          <w:tcPr>
-            <w:tcW w:w="1317" w:type="dxa"/>
-          </w:tcPr>
-          <w:p>
-            <w:r>
-              <w:t>8</w:t>
-            </w:r>
-          </w:p>
-        </w:tc>
-        <w:tc>
-          <w:tcPr>
             <w:tcW w:w="2248" w:type="dxa"/>
           </w:tcPr>
-          <w:p/>
+          <w:p>
+            <w:r>
+              <w:t>27</w:t>
+            </w:r>
+          </w:p>
         </w:tc>
       </w:tr>
       <w:tr>
@@ -720,7 +727,11 @@
           <w:tcPr>
             <w:tcW w:w="1166" w:type="dxa"/>
           </w:tcPr>
-          <w:p/>
+          <w:p>
+            <w:r>
+              <w:t>12h 30m</w:t>
+            </w:r>
+          </w:p>
         </w:tc>
         <w:tc>
           <w:tcPr>
@@ -746,7 +757,11 @@
           <w:tcPr>
             <w:tcW w:w="2248" w:type="dxa"/>
           </w:tcPr>
-          <w:p/>
+          <w:p>
+            <w:r>
+              <w:t>92h 15m</w:t>
+            </w:r>
+          </w:p>
         </w:tc>
       </w:tr>
       <w:tr>
@@ -829,7 +844,11 @@
           <w:tcPr>
             <w:tcW w:w="1166" w:type="dxa"/>
           </w:tcPr>
-          <w:p/>
+          <w:p>
+            <w:r>
+              <w:t>348h 30m</w:t>
+            </w:r>
+          </w:p>
         </w:tc>
         <w:tc>
           <w:tcPr>
@@ -865,12 +884,50 @@
     </w:tbl>
     <w:p/>
     <w:p>
+      <w:pPr>
+        <w:rPr>
+          <w:b/>
+          <w:bCs/>
+        </w:rPr>
+      </w:pPr>
       <w:r>
         <w:rPr>
           <w:b/>
           <w:bCs/>
         </w:rPr>
         <w:t>Team meetings:</w:t>
+      </w:r>
+    </w:p>
+    <w:p>
+      <w:pPr>
+        <w:rPr>
+          <w:lang w:val="en-NZ"/>
+        </w:rPr>
+      </w:pPr>
+      <w:r>
+        <w:rPr>
+          <w:lang w:val="en-NZ"/>
+        </w:rPr>
+        <w:t>Monday</w:t>
+      </w:r>
+      <w:r>
+        <w:rPr>
+          <w:lang w:val="en-NZ"/>
+        </w:rPr>
+        <w:t xml:space="preserve"> 10-12:30: Auditing logs, collating logs into group timesheet, progress check on all the documents due this week</w:t>
+      </w:r>
+    </w:p>
+    <w:p>
+      <w:pPr>
+        <w:rPr>
+          <w:lang w:val="en-NZ"/>
+        </w:rPr>
+      </w:pPr>
+      <w:r>
+        <w:rPr>
+          <w:lang w:val="en-NZ"/>
+        </w:rPr>
+        <w:t>Tuesday 10-11: Team meeting where we discussed work needed. Looked at the poster, the team decided the new colour scheme was bad, so we picked new colours. Also decided that we needed some new graphs that included the setup time for the LLM scripts.</w:t>
       </w:r>
     </w:p>
     <w:p>
@@ -889,12 +946,31 @@
       </w:r>
     </w:p>
     <w:p>
+      <w:pPr>
+        <w:rPr>
+          <w:b/>
+          <w:bCs/>
+        </w:rPr>
+      </w:pPr>
       <w:r>
         <w:rPr>
           <w:b/>
           <w:bCs/>
         </w:rPr>
         <w:t>Advisor meetings:</w:t>
+      </w:r>
+    </w:p>
+    <w:p>
+      <w:pPr>
+        <w:rPr>
+          <w:lang w:val="en-NZ"/>
+        </w:rPr>
+      </w:pPr>
+      <w:r>
+        <w:rPr>
+          <w:lang w:val="en-NZ"/>
+        </w:rPr>
+        <w:t>Tuesday 9-10: Bryce meeting</w:t>
       </w:r>
     </w:p>
     <w:p>
@@ -921,6 +997,50 @@
       </w:r>
       <w:r>
         <w:t>1 hour each for individual logs.</w:t>
+      </w:r>
+    </w:p>
+    <w:p>
+      <w:pPr>
+        <w:rPr>
+          <w:b/>
+          <w:bCs/>
+        </w:rPr>
+      </w:pPr>
+      <w:r>
+        <w:rPr>
+          <w:b/>
+          <w:bCs/>
+        </w:rPr>
+        <w:t>Other:</w:t>
+      </w:r>
+    </w:p>
+    <w:p>
+      <w:pPr>
+        <w:tabs>
+          <w:tab w:val="left" w:pos="5978"/>
+        </w:tabs>
+        <w:rPr>
+          <w:lang w:val="en-NZ"/>
+        </w:rPr>
+      </w:pPr>
+      <w:r>
+        <w:rPr>
+          <w:lang w:val="en-NZ"/>
+        </w:rPr>
+        <w:lastRenderedPageBreak/>
+        <w:t>Six hours of p</w:t>
+      </w:r>
+      <w:r>
+        <w:rPr>
+          <w:lang w:val="en-NZ"/>
+        </w:rPr>
+        <w:t>anel</w:t>
+      </w:r>
+      <w:r>
+        <w:rPr>
+          <w:lang w:val="en-NZ"/>
+        </w:rPr>
+        <w:t xml:space="preserve"> prep, and two hours of actual panel presentation.</w:t>
       </w:r>
     </w:p>
     <w:p>
@@ -1039,7 +1159,6 @@
               <w:rPr>
                 <w:bCs/>
               </w:rPr>
-              <w:lastRenderedPageBreak/>
               <w:t>0915 Going through the Panel marking scheme</w:t>
             </w:r>
           </w:p>

</xml_diff>